<commit_message>
Update GitHub account links for publication
</commit_message>
<xml_diff>
--- a/100007801_Aly_AP.docx
+++ b/100007801_Aly_AP.docx
@@ -799,7 +799,7 @@
           <w:rFonts w:ascii="Times New Roman" w:hAnsi="Times New Roman"/>
           <w:sz w:val="22"/>
         </w:rPr>
-        <w:t>The system is divided into the browser HMI, Python application, InfluxDB, and Grafana. Python contains the production model, JSON control API, and asynchronous database writer. Docker Compose starts the services, defines persistent storage, and uses health-based startup dependencies (Docker, 2026).</w:t>
+        <w:t>The system is divided into the browser HMI, the Python application, InfluxDB, and Grafana. The Python application contains the production model, control API, and asynchronous database writer. Docker Compose starts all services and defines their network, environment variables, persistent storage, and startup dependencies. The use of health checks and dependency conditions follows the Compose approach for controlling service startup order (Docker, 2026).</w:t>
       </w:r>
     </w:p>
     <w:p>
@@ -809,7 +809,7 @@
       <w:r>
         <w:drawing>
           <wp:inline xmlns:a="http://schemas.openxmlformats.org/drawingml/2006/main" xmlns:pic="http://schemas.openxmlformats.org/drawingml/2006/picture">
-            <wp:extent cx="4434840" cy="1996570"/>
+            <wp:extent cx="5806440" cy="2614066"/>
             <wp:docPr id="1" name="Picture 1"/>
             <wp:cNvGraphicFramePr>
               <a:graphicFrameLocks noChangeAspect="1"/>
@@ -830,7 +830,7 @@
                   <pic:spPr>
                     <a:xfrm>
                       <a:off x="0" y="0"/>
-                      <a:ext cx="4434840" cy="1996570"/>
+                      <a:ext cx="5806440" cy="2614066"/>
                     </a:xfrm>
                     <a:prstGeom prst="rect"/>
                   </pic:spPr>
@@ -846,7 +846,7 @@
         <w:pStyle w:val="CaptionCustom"/>
       </w:pPr>
       <w:r>
-        <w:t>Figure 1. System architecture and data flow (author’s illustration).</w:t>
+        <w:t>Figure 1. System architecture and data flow (author’s own illustration).</w:t>
       </w:r>
     </w:p>
     <w:p>
@@ -858,7 +858,7 @@
           <w:rFonts w:ascii="Times New Roman" w:hAnsi="Times New Roman"/>
           <w:sz w:val="22"/>
         </w:rPr>
-        <w:t>The ProductionLine class protects its machine snapshot with a re-entrant lock. A production thread waits for Start and executes the stage sequence. Stop pauses the cycle, Reset clears counters while stopped, Acknowledge clears a fault, and Emergency Stop changes the state immediately. The HMI uses endpoints such as /api/status, /api/start, /api/stop, and /api/settings.</w:t>
+        <w:t>The ProductionLine class owns the machine snapshot and protects it with a re-entrant lock. A dedicated production thread waits for the Start command and then executes the stage sequence. Stop pauses the current cycle, Reset clears counters when the line is not running, Acknowledge clears a fault, and Emergency Stop immediately changes the machine state. The HMI communicates through JSON endpoints such as /api/status, /api/start, /api/stop, and /api/settings.</w:t>
       </w:r>
     </w:p>
     <w:p>
@@ -879,7 +879,7 @@
           <w:rFonts w:ascii="Times New Roman" w:hAnsi="Times New Roman"/>
           <w:sz w:val="22"/>
         </w:rPr>
-        <w:t>The configured final-product defect probability is distributed across five checkpoints. To avoid multiplying the intended rejection rate, the program calculates a per-stage probability of 1 - (1 - p)^(1/5). A failed measurement is changed to an out-of-tolerance value and its reason is preserved until sorting.</w:t>
+        <w:t>A configurable final-product defect probability is distributed across five inspection points. Applying the full probability at every station would create a much higher final rejection rate, so the implementation calculates the equivalent per-stage probability as 1 - (1 - p)^(1/5). Once a defect is assigned, the corresponding measurement is changed to a realistic out-of-tolerance value and the reason is preserved until sorting.</w:t>
       </w:r>
     </w:p>
     <w:tbl>
@@ -901,10 +901,10 @@
             <w:tcW w:type="dxa" w:w="1944"/>
             <w:shd w:fill="1F2937"/>
             <w:tcMar>
-              <w:top w:w="45" w:type="dxa"/>
-              <w:start w:w="85" w:type="dxa"/>
-              <w:bottom w:w="45" w:type="dxa"/>
-              <w:end w:w="85" w:type="dxa"/>
+              <w:top w:w="80" w:type="dxa"/>
+              <w:start w:w="100" w:type="dxa"/>
+              <w:bottom w:w="80" w:type="dxa"/>
+              <w:end w:w="100" w:type="dxa"/>
             </w:tcMar>
             <w:vAlign w:val="center"/>
           </w:tcPr>
@@ -917,7 +917,7 @@
                 <w:rFonts w:ascii="Arial" w:hAnsi="Arial"/>
                 <w:b/>
                 <w:color w:val="FFFFFF"/>
-                <w:sz w:val="15"/>
+                <w:sz w:val="17"/>
               </w:rPr>
               <w:t>Station</w:t>
             </w:r>
@@ -928,10 +928,10 @@
             <w:tcW w:type="dxa" w:w="2592"/>
             <w:shd w:fill="1F2937"/>
             <w:tcMar>
-              <w:top w:w="45" w:type="dxa"/>
-              <w:start w:w="85" w:type="dxa"/>
-              <w:bottom w:w="45" w:type="dxa"/>
-              <w:end w:w="85" w:type="dxa"/>
+              <w:top w:w="80" w:type="dxa"/>
+              <w:start w:w="100" w:type="dxa"/>
+              <w:bottom w:w="80" w:type="dxa"/>
+              <w:end w:w="100" w:type="dxa"/>
             </w:tcMar>
             <w:vAlign w:val="center"/>
           </w:tcPr>
@@ -944,7 +944,7 @@
                 <w:rFonts w:ascii="Arial" w:hAnsi="Arial"/>
                 <w:b/>
                 <w:color w:val="FFFFFF"/>
-                <w:sz w:val="15"/>
+                <w:sz w:val="17"/>
               </w:rPr>
               <w:t>Example measurement</w:t>
             </w:r>
@@ -955,10 +955,10 @@
             <w:tcW w:type="dxa" w:w="4320"/>
             <w:shd w:fill="1F2937"/>
             <w:tcMar>
-              <w:top w:w="45" w:type="dxa"/>
-              <w:start w:w="85" w:type="dxa"/>
-              <w:bottom w:w="45" w:type="dxa"/>
-              <w:end w:w="85" w:type="dxa"/>
+              <w:top w:w="80" w:type="dxa"/>
+              <w:start w:w="100" w:type="dxa"/>
+              <w:bottom w:w="80" w:type="dxa"/>
+              <w:end w:w="100" w:type="dxa"/>
             </w:tcMar>
             <w:vAlign w:val="center"/>
           </w:tcPr>
@@ -971,7 +971,7 @@
                 <w:rFonts w:ascii="Arial" w:hAnsi="Arial"/>
                 <w:b/>
                 <w:color w:val="FFFFFF"/>
-                <w:sz w:val="15"/>
+                <w:sz w:val="17"/>
               </w:rPr>
               <w:t>Possible rejection reason</w:t>
             </w:r>
@@ -983,10 +983,10 @@
           <w:tcPr>
             <w:tcW w:type="dxa" w:w="1944"/>
             <w:tcMar>
-              <w:top w:w="40" w:type="dxa"/>
-              <w:start w:w="85" w:type="dxa"/>
-              <w:bottom w:w="40" w:type="dxa"/>
-              <w:end w:w="85" w:type="dxa"/>
+              <w:top w:w="80" w:type="dxa"/>
+              <w:start w:w="100" w:type="dxa"/>
+              <w:bottom w:w="80" w:type="dxa"/>
+              <w:end w:w="100" w:type="dxa"/>
             </w:tcMar>
           </w:tcPr>
           <w:p>
@@ -997,7 +997,7 @@
             <w:r>
               <w:rPr>
                 <w:rFonts w:ascii="Times New Roman" w:hAnsi="Times New Roman"/>
-                <w:sz w:val="15"/>
+                <w:sz w:val="17"/>
               </w:rPr>
               <w:t>Body feed</w:t>
             </w:r>
@@ -1007,10 +1007,10 @@
           <w:tcPr>
             <w:tcW w:type="dxa" w:w="2592"/>
             <w:tcMar>
-              <w:top w:w="40" w:type="dxa"/>
-              <w:start w:w="85" w:type="dxa"/>
-              <w:bottom w:w="40" w:type="dxa"/>
-              <w:end w:w="85" w:type="dxa"/>
+              <w:top w:w="80" w:type="dxa"/>
+              <w:start w:w="100" w:type="dxa"/>
+              <w:bottom w:w="80" w:type="dxa"/>
+              <w:end w:w="100" w:type="dxa"/>
             </w:tcMar>
           </w:tcPr>
           <w:p>
@@ -1021,7 +1021,7 @@
             <w:r>
               <w:rPr>
                 <w:rFonts w:ascii="Times New Roman" w:hAnsi="Times New Roman"/>
-                <w:sz w:val="15"/>
+                <w:sz w:val="17"/>
               </w:rPr>
               <w:t>Body length / presence</w:t>
             </w:r>
@@ -1031,10 +1031,10 @@
           <w:tcPr>
             <w:tcW w:type="dxa" w:w="4320"/>
             <w:tcMar>
-              <w:top w:w="40" w:type="dxa"/>
-              <w:start w:w="85" w:type="dxa"/>
-              <w:bottom w:w="40" w:type="dxa"/>
-              <w:end w:w="85" w:type="dxa"/>
+              <w:top w:w="80" w:type="dxa"/>
+              <w:start w:w="100" w:type="dxa"/>
+              <w:bottom w:w="80" w:type="dxa"/>
+              <w:end w:w="100" w:type="dxa"/>
             </w:tcMar>
           </w:tcPr>
           <w:p>
@@ -1045,7 +1045,7 @@
             <w:r>
               <w:rPr>
                 <w:rFonts w:ascii="Times New Roman" w:hAnsi="Times New Roman"/>
-                <w:sz w:val="15"/>
+                <w:sz w:val="17"/>
               </w:rPr>
               <w:t>Cracked body or missing body</w:t>
             </w:r>
@@ -1057,10 +1057,10 @@
           <w:tcPr>
             <w:tcW w:type="dxa" w:w="1944"/>
             <w:tcMar>
-              <w:top w:w="40" w:type="dxa"/>
-              <w:start w:w="85" w:type="dxa"/>
-              <w:bottom w:w="40" w:type="dxa"/>
-              <w:end w:w="85" w:type="dxa"/>
+              <w:top w:w="80" w:type="dxa"/>
+              <w:start w:w="100" w:type="dxa"/>
+              <w:bottom w:w="80" w:type="dxa"/>
+              <w:end w:w="100" w:type="dxa"/>
             </w:tcMar>
             <w:shd w:fill="F2F4F7"/>
           </w:tcPr>
@@ -1072,7 +1072,7 @@
             <w:r>
               <w:rPr>
                 <w:rFonts w:ascii="Times New Roman" w:hAnsi="Times New Roman"/>
-                <w:sz w:val="15"/>
+                <w:sz w:val="17"/>
               </w:rPr>
               <w:t>Core insertion</w:t>
             </w:r>
@@ -1082,10 +1082,10 @@
           <w:tcPr>
             <w:tcW w:type="dxa" w:w="2592"/>
             <w:tcMar>
-              <w:top w:w="40" w:type="dxa"/>
-              <w:start w:w="85" w:type="dxa"/>
-              <w:bottom w:w="40" w:type="dxa"/>
-              <w:end w:w="85" w:type="dxa"/>
+              <w:top w:w="80" w:type="dxa"/>
+              <w:start w:w="100" w:type="dxa"/>
+              <w:bottom w:w="80" w:type="dxa"/>
+              <w:end w:w="100" w:type="dxa"/>
             </w:tcMar>
             <w:shd w:fill="F2F4F7"/>
           </w:tcPr>
@@ -1097,7 +1097,7 @@
             <w:r>
               <w:rPr>
                 <w:rFonts w:ascii="Times New Roman" w:hAnsi="Times New Roman"/>
-                <w:sz w:val="15"/>
+                <w:sz w:val="17"/>
               </w:rPr>
               <w:t>Graphite offset</w:t>
             </w:r>
@@ -1107,10 +1107,10 @@
           <w:tcPr>
             <w:tcW w:type="dxa" w:w="4320"/>
             <w:tcMar>
-              <w:top w:w="40" w:type="dxa"/>
-              <w:start w:w="85" w:type="dxa"/>
-              <w:bottom w:w="40" w:type="dxa"/>
-              <w:end w:w="85" w:type="dxa"/>
+              <w:top w:w="80" w:type="dxa"/>
+              <w:start w:w="100" w:type="dxa"/>
+              <w:bottom w:w="80" w:type="dxa"/>
+              <w:end w:w="100" w:type="dxa"/>
             </w:tcMar>
             <w:shd w:fill="F2F4F7"/>
           </w:tcPr>
@@ -1122,7 +1122,7 @@
             <w:r>
               <w:rPr>
                 <w:rFonts w:ascii="Times New Roman" w:hAnsi="Times New Roman"/>
-                <w:sz w:val="15"/>
+                <w:sz w:val="17"/>
               </w:rPr>
               <w:t>Misaligned or broken graphite</w:t>
             </w:r>
@@ -1134,10 +1134,10 @@
           <w:tcPr>
             <w:tcW w:type="dxa" w:w="1944"/>
             <w:tcMar>
-              <w:top w:w="40" w:type="dxa"/>
-              <w:start w:w="85" w:type="dxa"/>
-              <w:bottom w:w="40" w:type="dxa"/>
-              <w:end w:w="85" w:type="dxa"/>
+              <w:top w:w="80" w:type="dxa"/>
+              <w:start w:w="100" w:type="dxa"/>
+              <w:bottom w:w="80" w:type="dxa"/>
+              <w:end w:w="100" w:type="dxa"/>
             </w:tcMar>
           </w:tcPr>
           <w:p>
@@ -1148,7 +1148,7 @@
             <w:r>
               <w:rPr>
                 <w:rFonts w:ascii="Times New Roman" w:hAnsi="Times New Roman"/>
-                <w:sz w:val="15"/>
+                <w:sz w:val="17"/>
               </w:rPr>
               <w:t>Ferrule press</w:t>
             </w:r>
@@ -1158,10 +1158,10 @@
           <w:tcPr>
             <w:tcW w:type="dxa" w:w="2592"/>
             <w:tcMar>
-              <w:top w:w="40" w:type="dxa"/>
-              <w:start w:w="85" w:type="dxa"/>
-              <w:bottom w:w="40" w:type="dxa"/>
-              <w:end w:w="85" w:type="dxa"/>
+              <w:top w:w="80" w:type="dxa"/>
+              <w:start w:w="100" w:type="dxa"/>
+              <w:bottom w:w="80" w:type="dxa"/>
+              <w:end w:w="100" w:type="dxa"/>
             </w:tcMar>
           </w:tcPr>
           <w:p>
@@ -1172,7 +1172,7 @@
             <w:r>
               <w:rPr>
                 <w:rFonts w:ascii="Times New Roman" w:hAnsi="Times New Roman"/>
-                <w:sz w:val="15"/>
+                <w:sz w:val="17"/>
               </w:rPr>
               <w:t>Clamp force</w:t>
             </w:r>
@@ -1182,10 +1182,10 @@
           <w:tcPr>
             <w:tcW w:type="dxa" w:w="4320"/>
             <w:tcMar>
-              <w:top w:w="40" w:type="dxa"/>
-              <w:start w:w="85" w:type="dxa"/>
-              <w:bottom w:w="40" w:type="dxa"/>
-              <w:end w:w="85" w:type="dxa"/>
+              <w:top w:w="80" w:type="dxa"/>
+              <w:start w:w="100" w:type="dxa"/>
+              <w:bottom w:w="80" w:type="dxa"/>
+              <w:end w:w="100" w:type="dxa"/>
             </w:tcMar>
           </w:tcPr>
           <w:p>
@@ -1196,7 +1196,7 @@
             <w:r>
               <w:rPr>
                 <w:rFonts w:ascii="Times New Roman" w:hAnsi="Times New Roman"/>
-                <w:sz w:val="15"/>
+                <w:sz w:val="17"/>
               </w:rPr>
               <w:t>Ferrule not seated / low force</w:t>
             </w:r>
@@ -1208,10 +1208,10 @@
           <w:tcPr>
             <w:tcW w:type="dxa" w:w="1944"/>
             <w:tcMar>
-              <w:top w:w="40" w:type="dxa"/>
-              <w:start w:w="85" w:type="dxa"/>
-              <w:bottom w:w="40" w:type="dxa"/>
-              <w:end w:w="85" w:type="dxa"/>
+              <w:top w:w="80" w:type="dxa"/>
+              <w:start w:w="100" w:type="dxa"/>
+              <w:bottom w:w="80" w:type="dxa"/>
+              <w:end w:w="100" w:type="dxa"/>
             </w:tcMar>
             <w:shd w:fill="F2F4F7"/>
           </w:tcPr>
@@ -1223,7 +1223,7 @@
             <w:r>
               <w:rPr>
                 <w:rFonts w:ascii="Times New Roman" w:hAnsi="Times New Roman"/>
-                <w:sz w:val="15"/>
+                <w:sz w:val="17"/>
               </w:rPr>
               <w:t>Eraser insertion</w:t>
             </w:r>
@@ -1233,10 +1233,10 @@
           <w:tcPr>
             <w:tcW w:type="dxa" w:w="2592"/>
             <w:tcMar>
-              <w:top w:w="40" w:type="dxa"/>
-              <w:start w:w="85" w:type="dxa"/>
-              <w:bottom w:w="40" w:type="dxa"/>
-              <w:end w:w="85" w:type="dxa"/>
+              <w:top w:w="80" w:type="dxa"/>
+              <w:start w:w="100" w:type="dxa"/>
+              <w:bottom w:w="80" w:type="dxa"/>
+              <w:end w:w="100" w:type="dxa"/>
             </w:tcMar>
             <w:shd w:fill="F2F4F7"/>
           </w:tcPr>
@@ -1248,7 +1248,7 @@
             <w:r>
               <w:rPr>
                 <w:rFonts w:ascii="Times New Roman" w:hAnsi="Times New Roman"/>
-                <w:sz w:val="15"/>
+                <w:sz w:val="17"/>
               </w:rPr>
               <w:t>Presence / depth</w:t>
             </w:r>
@@ -1258,10 +1258,10 @@
           <w:tcPr>
             <w:tcW w:type="dxa" w:w="4320"/>
             <w:tcMar>
-              <w:top w:w="40" w:type="dxa"/>
-              <w:start w:w="85" w:type="dxa"/>
-              <w:bottom w:w="40" w:type="dxa"/>
-              <w:end w:w="85" w:type="dxa"/>
+              <w:top w:w="80" w:type="dxa"/>
+              <w:start w:w="100" w:type="dxa"/>
+              <w:bottom w:w="80" w:type="dxa"/>
+              <w:end w:w="100" w:type="dxa"/>
             </w:tcMar>
             <w:shd w:fill="F2F4F7"/>
           </w:tcPr>
@@ -1273,7 +1273,7 @@
             <w:r>
               <w:rPr>
                 <w:rFonts w:ascii="Times New Roman" w:hAnsi="Times New Roman"/>
-                <w:sz w:val="15"/>
+                <w:sz w:val="17"/>
               </w:rPr>
               <w:t>Missing or incorrect insertion depth</w:t>
             </w:r>
@@ -1285,10 +1285,10 @@
           <w:tcPr>
             <w:tcW w:type="dxa" w:w="1944"/>
             <w:tcMar>
-              <w:top w:w="40" w:type="dxa"/>
-              <w:start w:w="85" w:type="dxa"/>
-              <w:bottom w:w="40" w:type="dxa"/>
-              <w:end w:w="85" w:type="dxa"/>
+              <w:top w:w="80" w:type="dxa"/>
+              <w:start w:w="100" w:type="dxa"/>
+              <w:bottom w:w="80" w:type="dxa"/>
+              <w:end w:w="100" w:type="dxa"/>
             </w:tcMar>
           </w:tcPr>
           <w:p>
@@ -1299,7 +1299,7 @@
             <w:r>
               <w:rPr>
                 <w:rFonts w:ascii="Times New Roman" w:hAnsi="Times New Roman"/>
-                <w:sz w:val="15"/>
+                <w:sz w:val="17"/>
               </w:rPr>
               <w:t>Final inspection</w:t>
             </w:r>
@@ -1309,10 +1309,10 @@
           <w:tcPr>
             <w:tcW w:type="dxa" w:w="2592"/>
             <w:tcMar>
-              <w:top w:w="40" w:type="dxa"/>
-              <w:start w:w="85" w:type="dxa"/>
-              <w:bottom w:w="40" w:type="dxa"/>
-              <w:end w:w="85" w:type="dxa"/>
+              <w:top w:w="80" w:type="dxa"/>
+              <w:start w:w="100" w:type="dxa"/>
+              <w:bottom w:w="80" w:type="dxa"/>
+              <w:end w:w="100" w:type="dxa"/>
             </w:tcMar>
           </w:tcPr>
           <w:p>
@@ -1323,7 +1323,7 @@
             <w:r>
               <w:rPr>
                 <w:rFonts w:ascii="Times New Roman" w:hAnsi="Times New Roman"/>
-                <w:sz w:val="15"/>
+                <w:sz w:val="17"/>
               </w:rPr>
               <w:t>Length / surface score</w:t>
             </w:r>
@@ -1333,10 +1333,10 @@
           <w:tcPr>
             <w:tcW w:type="dxa" w:w="4320"/>
             <w:tcMar>
-              <w:top w:w="40" w:type="dxa"/>
-              <w:start w:w="85" w:type="dxa"/>
-              <w:bottom w:w="40" w:type="dxa"/>
-              <w:end w:w="85" w:type="dxa"/>
+              <w:top w:w="80" w:type="dxa"/>
+              <w:start w:w="100" w:type="dxa"/>
+              <w:bottom w:w="80" w:type="dxa"/>
+              <w:end w:w="100" w:type="dxa"/>
             </w:tcMar>
           </w:tcPr>
           <w:p>
@@ -1347,7 +1347,7 @@
             <w:r>
               <w:rPr>
                 <w:rFonts w:ascii="Times New Roman" w:hAnsi="Times New Roman"/>
-                <w:sz w:val="15"/>
+                <w:sz w:val="17"/>
               </w:rPr>
               <w:t>Length or visual surface defect</w:t>
             </w:r>
@@ -1384,7 +1384,7 @@
           <w:rFonts w:ascii="Times New Roman" w:hAnsi="Times New Roman"/>
           <w:sz w:val="22"/>
         </w:rPr>
-        <w:t>The browser HMI uses HTML, CSS, and JavaScript. It includes Start, Stop, Reset, Acknowledge, Emergency Stop, speed, defect probability, and a demonstration-fault button. The page polls the Python API every 500 ms and updates the active stage, counters, yield, temperature, cycle time, database status, recent products, and event log.</w:t>
+        <w:t>The frontend is a browser-based HMI implemented with HTML, CSS, and JavaScript. It includes the required Start, Stop, and Reset buttons and adds Acknowledge, Emergency Stop, speed control, defect-probability control, and a demonstration fault button. The page polls the Python API every 500 ms and updates the current stage, product number, counters, yield, motor temperature, cycle time, database connection, product table, and operator event log.</w:t>
       </w:r>
     </w:p>
     <w:p>
@@ -1394,7 +1394,7 @@
       <w:r>
         <w:drawing>
           <wp:inline xmlns:a="http://schemas.openxmlformats.org/drawingml/2006/main" xmlns:pic="http://schemas.openxmlformats.org/drawingml/2006/picture">
-            <wp:extent cx="3931920" cy="3800856"/>
+            <wp:extent cx="5715000" cy="5524500"/>
             <wp:docPr id="2" name="Picture 2"/>
             <wp:cNvGraphicFramePr>
               <a:graphicFrameLocks noChangeAspect="1"/>
@@ -1415,7 +1415,7 @@
                   <pic:spPr>
                     <a:xfrm>
                       <a:off x="0" y="0"/>
-                      <a:ext cx="3931920" cy="3800856"/>
+                      <a:ext cx="5715000" cy="5524500"/>
                     </a:xfrm>
                     <a:prstGeom prst="rect"/>
                   </pic:spPr>
@@ -1431,7 +1431,7 @@
         <w:pStyle w:val="CaptionCustom"/>
       </w:pPr>
       <w:r>
-        <w:t>Figure 2. Browser HMI during production (author’s screenshot).</w:t>
+        <w:t>Figure 2. Browser-based production HMI showing the active stage and quality statistics (author’s own screenshot).</w:t>
       </w:r>
     </w:p>
     <w:p>
@@ -1443,7 +1443,7 @@
           <w:rFonts w:ascii="Times New Roman" w:hAnsi="Times New Roman"/>
           <w:sz w:val="22"/>
         </w:rPr>
-        <w:t>Color and text are combined so state is not communicated by color alone. A fault changes the state indicator, displays an alarm banner, blocks Start, and requires acknowledgement. Emergency Stop retains a distinct state. Product defects only update the product record and rejected counter; they do not stop the machine.</w:t>
+        <w:t>The interface uses color and text together so that state is not communicated by color alone. A fault changes the state indicator, displays a full-width alarm banner, writes a critical event, blocks a new Start command, and requires acknowledgement. The Emergency Stop uses the same controlled recovery path but retains a distinct EMERGENCY_STOP state. Product defects do not cause a machine fault; they are recorded in the recent-product table and increase the rejected counter.</w:t>
       </w:r>
     </w:p>
     <w:p>
@@ -1464,7 +1464,7 @@
           <w:rFonts w:ascii="Times New Roman" w:hAnsi="Times New Roman"/>
           <w:sz w:val="22"/>
         </w:rPr>
-        <w:t>The database client uses a bounded queue and separate worker thread, preventing network delays from blocking production. Writes have a timeout, one retry, and health checks. API bodies are size-limited and validated, and dynamic HMI text is HTML-escaped. Real deployment would still require authentication and a production-grade server.</w:t>
+        <w:t>The database client runs in a separate worker thread with a bounded queue. This prevents network delays from blocking the production cycle. Writes have a short timeout, one delayed retry, and periodic health checks. API request bodies are size-limited and validated, and dynamic text displayed by JavaScript is HTML-escaped. These measures are appropriate for a classroom simulation, although additional authentication and production-grade server software would be required in an industrial deployment.</w:t>
       </w:r>
     </w:p>
     <w:p>
@@ -1491,7 +1491,7 @@
           <w:rFonts w:ascii="Times New Roman" w:hAnsi="Times New Roman"/>
           <w:sz w:val="22"/>
         </w:rPr>
-        <w:t>InfluxDB stores timestamped telemetry in the pencil_production bucket. Line-protocol fields include temperature, total/good/defect counts, cycle time, state code, stage index, defective flag, yield, machine-state text, and defect reason. Tags identify the machine, state, stage, and event. Docker setup and HTTP writes follow the InfluxDB v2 documentation (InfluxData, 2026a, 2026b).</w:t>
+        <w:t>InfluxDB stores timestamped production telemetry in the pencil_production bucket. The application sends line-protocol records to the InfluxDB v2 HTTP write endpoint. Fields include temperature, total count, good count, defect count, cycle time, state code, stage index, defective-product flag, yield percentage, machine-state text, and defect reason. Tags identify the machine, state, stage, and event. InfluxData documents Docker-based setup and the HTTP API as supported methods for running and writing to InfluxDB v2 (InfluxData, 2026a, 2026b).</w:t>
       </w:r>
     </w:p>
     <w:p>
@@ -1503,7 +1503,7 @@
           <w:rFonts w:ascii="Times New Roman" w:hAnsi="Times New Roman"/>
           <w:sz w:val="22"/>
         </w:rPr>
-        <w:t>Grafana is provisioned from YAML and JSON files. Its Flux data source receives the organization, bucket, and token through environment variables. The dashboard shows temperature, cycle time, output, first-pass yield, mapped machine state, and latest status. Configuration-file provisioning makes the setup reproducible (Grafana Labs, 2026).</w:t>
+        <w:t>Grafana is automatically configured from YAML and JSON files mounted into its provisioning directories. The data source uses Flux with the organization, bucket, and token supplied through environment variables. The dashboard contains temperature and cycle-time trends, output statistics, first-pass yield, mapped machine states, and latest status information. Grafana supports provisioning an InfluxDB data source in configuration files, which makes the dashboard reproducible rather than dependent on manual setup (Grafana Labs, 2026).</w:t>
       </w:r>
     </w:p>
     <w:p>
@@ -1513,7 +1513,7 @@
       <w:r>
         <w:drawing>
           <wp:inline xmlns:a="http://schemas.openxmlformats.org/drawingml/2006/main" xmlns:pic="http://schemas.openxmlformats.org/drawingml/2006/picture">
-            <wp:extent cx="5166360" cy="2952206"/>
+            <wp:extent cx="5806440" cy="3317966"/>
             <wp:docPr id="3" name="Picture 3"/>
             <wp:cNvGraphicFramePr>
               <a:graphicFrameLocks noChangeAspect="1"/>
@@ -1534,7 +1534,7 @@
                   <pic:spPr>
                     <a:xfrm>
                       <a:off x="0" y="0"/>
-                      <a:ext cx="5166360" cy="2952206"/>
+                      <a:ext cx="5806440" cy="3317966"/>
                     </a:xfrm>
                     <a:prstGeom prst="rect"/>
                   </pic:spPr>
@@ -1593,7 +1593,7 @@
                 <w:rFonts w:ascii="Times New Roman" w:hAnsi="Times New Roman"/>
                 <w:sz w:val="19"/>
               </w:rPr>
-              <w:t>HMI: 8000; InfluxDB: 8086; Grafana: 3000. Named volumes preserve data between restarts.</w:t>
+              <w:t>pencil-hmi exposes port 8000, pencil-influxdb exposes port 8086, and pencil-grafana exposes port 3000. Named volumes preserve database and dashboard state between restarts.</w:t>
             </w:r>
           </w:p>
         </w:tc>
@@ -1650,10 +1650,10 @@
             <w:tcW w:type="dxa" w:w="1944"/>
             <w:shd w:fill="1F2937"/>
             <w:tcMar>
-              <w:top w:w="45" w:type="dxa"/>
-              <w:start w:w="85" w:type="dxa"/>
-              <w:bottom w:w="45" w:type="dxa"/>
-              <w:end w:w="85" w:type="dxa"/>
+              <w:top w:w="80" w:type="dxa"/>
+              <w:start w:w="100" w:type="dxa"/>
+              <w:bottom w:w="80" w:type="dxa"/>
+              <w:end w:w="100" w:type="dxa"/>
             </w:tcMar>
             <w:vAlign w:val="center"/>
           </w:tcPr>
@@ -1666,7 +1666,7 @@
                 <w:rFonts w:ascii="Arial" w:hAnsi="Arial"/>
                 <w:b/>
                 <w:color w:val="FFFFFF"/>
-                <w:sz w:val="14"/>
+                <w:sz w:val="16"/>
               </w:rPr>
               <w:t>Test area</w:t>
             </w:r>
@@ -1677,10 +1677,10 @@
             <w:tcW w:type="dxa" w:w="5688"/>
             <w:shd w:fill="1F2937"/>
             <w:tcMar>
-              <w:top w:w="45" w:type="dxa"/>
-              <w:start w:w="85" w:type="dxa"/>
-              <w:bottom w:w="45" w:type="dxa"/>
-              <w:end w:w="85" w:type="dxa"/>
+              <w:top w:w="80" w:type="dxa"/>
+              <w:start w:w="100" w:type="dxa"/>
+              <w:bottom w:w="80" w:type="dxa"/>
+              <w:end w:w="100" w:type="dxa"/>
             </w:tcMar>
             <w:vAlign w:val="center"/>
           </w:tcPr>
@@ -1693,7 +1693,7 @@
                 <w:rFonts w:ascii="Arial" w:hAnsi="Arial"/>
                 <w:b/>
                 <w:color w:val="FFFFFF"/>
-                <w:sz w:val="14"/>
+                <w:sz w:val="16"/>
               </w:rPr>
               <w:t>Expected behavior</w:t>
             </w:r>
@@ -1704,10 +1704,10 @@
             <w:tcW w:type="dxa" w:w="1224"/>
             <w:shd w:fill="1F2937"/>
             <w:tcMar>
-              <w:top w:w="45" w:type="dxa"/>
-              <w:start w:w="85" w:type="dxa"/>
-              <w:bottom w:w="45" w:type="dxa"/>
-              <w:end w:w="85" w:type="dxa"/>
+              <w:top w:w="80" w:type="dxa"/>
+              <w:start w:w="100" w:type="dxa"/>
+              <w:bottom w:w="80" w:type="dxa"/>
+              <w:end w:w="100" w:type="dxa"/>
             </w:tcMar>
             <w:vAlign w:val="center"/>
           </w:tcPr>
@@ -1720,7 +1720,7 @@
                 <w:rFonts w:ascii="Arial" w:hAnsi="Arial"/>
                 <w:b/>
                 <w:color w:val="FFFFFF"/>
-                <w:sz w:val="14"/>
+                <w:sz w:val="16"/>
               </w:rPr>
               <w:t>Result</w:t>
             </w:r>
@@ -1732,10 +1732,10 @@
           <w:tcPr>
             <w:tcW w:type="dxa" w:w="1944"/>
             <w:tcMar>
-              <w:top w:w="40" w:type="dxa"/>
-              <w:start w:w="85" w:type="dxa"/>
-              <w:bottom w:w="40" w:type="dxa"/>
-              <w:end w:w="85" w:type="dxa"/>
+              <w:top w:w="80" w:type="dxa"/>
+              <w:start w:w="100" w:type="dxa"/>
+              <w:bottom w:w="80" w:type="dxa"/>
+              <w:end w:w="100" w:type="dxa"/>
             </w:tcMar>
           </w:tcPr>
           <w:p>
@@ -1746,7 +1746,7 @@
             <w:r>
               <w:rPr>
                 <w:rFonts w:ascii="Times New Roman" w:hAnsi="Times New Roman"/>
-                <w:sz w:val="14"/>
+                <w:sz w:val="16"/>
               </w:rPr>
               <w:t>Start and production</w:t>
             </w:r>
@@ -1756,10 +1756,10 @@
           <w:tcPr>
             <w:tcW w:type="dxa" w:w="5688"/>
             <w:tcMar>
-              <w:top w:w="40" w:type="dxa"/>
-              <w:start w:w="85" w:type="dxa"/>
-              <w:bottom w:w="40" w:type="dxa"/>
-              <w:end w:w="85" w:type="dxa"/>
+              <w:top w:w="80" w:type="dxa"/>
+              <w:start w:w="100" w:type="dxa"/>
+              <w:bottom w:w="80" w:type="dxa"/>
+              <w:end w:w="100" w:type="dxa"/>
             </w:tcMar>
           </w:tcPr>
           <w:p>
@@ -1770,9 +1770,9 @@
             <w:r>
               <w:rPr>
                 <w:rFonts w:ascii="Times New Roman" w:hAnsi="Times New Roman"/>
-                <w:sz w:val="14"/>
-              </w:rPr>
-              <w:t>Product completes; 0% defects gives only good output</w:t>
+                <w:sz w:val="16"/>
+              </w:rPr>
+              <w:t>At least one product completes; 0% defect setting produces only good products</w:t>
             </w:r>
           </w:p>
         </w:tc>
@@ -1780,10 +1780,10 @@
           <w:tcPr>
             <w:tcW w:type="dxa" w:w="1224"/>
             <w:tcMar>
-              <w:top w:w="40" w:type="dxa"/>
-              <w:start w:w="85" w:type="dxa"/>
-              <w:bottom w:w="40" w:type="dxa"/>
-              <w:end w:w="85" w:type="dxa"/>
+              <w:top w:w="80" w:type="dxa"/>
+              <w:start w:w="100" w:type="dxa"/>
+              <w:bottom w:w="80" w:type="dxa"/>
+              <w:end w:w="100" w:type="dxa"/>
             </w:tcMar>
           </w:tcPr>
           <w:p>
@@ -1794,7 +1794,7 @@
             <w:r>
               <w:rPr>
                 <w:rFonts w:ascii="Times New Roman" w:hAnsi="Times New Roman"/>
-                <w:sz w:val="14"/>
+                <w:sz w:val="16"/>
               </w:rPr>
               <w:t>Pass</w:t>
             </w:r>
@@ -1806,10 +1806,10 @@
           <w:tcPr>
             <w:tcW w:type="dxa" w:w="1944"/>
             <w:tcMar>
-              <w:top w:w="40" w:type="dxa"/>
-              <w:start w:w="85" w:type="dxa"/>
-              <w:bottom w:w="40" w:type="dxa"/>
-              <w:end w:w="85" w:type="dxa"/>
+              <w:top w:w="80" w:type="dxa"/>
+              <w:start w:w="100" w:type="dxa"/>
+              <w:bottom w:w="80" w:type="dxa"/>
+              <w:end w:w="100" w:type="dxa"/>
             </w:tcMar>
             <w:shd w:fill="F2F4F7"/>
           </w:tcPr>
@@ -1821,7 +1821,7 @@
             <w:r>
               <w:rPr>
                 <w:rFonts w:ascii="Times New Roman" w:hAnsi="Times New Roman"/>
-                <w:sz w:val="14"/>
+                <w:sz w:val="16"/>
               </w:rPr>
               <w:t>Stop and reset</w:t>
             </w:r>
@@ -1831,10 +1831,10 @@
           <w:tcPr>
             <w:tcW w:type="dxa" w:w="5688"/>
             <w:tcMar>
-              <w:top w:w="40" w:type="dxa"/>
-              <w:start w:w="85" w:type="dxa"/>
-              <w:bottom w:w="40" w:type="dxa"/>
-              <w:end w:w="85" w:type="dxa"/>
+              <w:top w:w="80" w:type="dxa"/>
+              <w:start w:w="100" w:type="dxa"/>
+              <w:bottom w:w="80" w:type="dxa"/>
+              <w:end w:w="100" w:type="dxa"/>
             </w:tcMar>
             <w:shd w:fill="F2F4F7"/>
           </w:tcPr>
@@ -1846,9 +1846,9 @@
             <w:r>
               <w:rPr>
                 <w:rFonts w:ascii="Times New Roman" w:hAnsi="Times New Roman"/>
-                <w:sz w:val="14"/>
-              </w:rPr>
-              <w:t>Stop changes state; reset clears counters</w:t>
+                <w:sz w:val="16"/>
+              </w:rPr>
+              <w:t>Stop changes state; reset clears counters when not running</w:t>
             </w:r>
           </w:p>
         </w:tc>
@@ -1856,10 +1856,10 @@
           <w:tcPr>
             <w:tcW w:type="dxa" w:w="1224"/>
             <w:tcMar>
-              <w:top w:w="40" w:type="dxa"/>
-              <w:start w:w="85" w:type="dxa"/>
-              <w:bottom w:w="40" w:type="dxa"/>
-              <w:end w:w="85" w:type="dxa"/>
+              <w:top w:w="80" w:type="dxa"/>
+              <w:start w:w="100" w:type="dxa"/>
+              <w:bottom w:w="80" w:type="dxa"/>
+              <w:end w:w="100" w:type="dxa"/>
             </w:tcMar>
             <w:shd w:fill="F2F4F7"/>
           </w:tcPr>
@@ -1871,7 +1871,7 @@
             <w:r>
               <w:rPr>
                 <w:rFonts w:ascii="Times New Roman" w:hAnsi="Times New Roman"/>
-                <w:sz w:val="14"/>
+                <w:sz w:val="16"/>
               </w:rPr>
               <w:t>Pass</w:t>
             </w:r>
@@ -1883,10 +1883,10 @@
           <w:tcPr>
             <w:tcW w:type="dxa" w:w="1944"/>
             <w:tcMar>
-              <w:top w:w="40" w:type="dxa"/>
-              <w:start w:w="85" w:type="dxa"/>
-              <w:bottom w:w="40" w:type="dxa"/>
-              <w:end w:w="85" w:type="dxa"/>
+              <w:top w:w="80" w:type="dxa"/>
+              <w:start w:w="100" w:type="dxa"/>
+              <w:bottom w:w="80" w:type="dxa"/>
+              <w:end w:w="100" w:type="dxa"/>
             </w:tcMar>
           </w:tcPr>
           <w:p>
@@ -1897,7 +1897,7 @@
             <w:r>
               <w:rPr>
                 <w:rFonts w:ascii="Times New Roman" w:hAnsi="Times New Roman"/>
-                <w:sz w:val="14"/>
+                <w:sz w:val="16"/>
               </w:rPr>
               <w:t>Emergency stop</w:t>
             </w:r>
@@ -1907,10 +1907,10 @@
           <w:tcPr>
             <w:tcW w:type="dxa" w:w="5688"/>
             <w:tcMar>
-              <w:top w:w="40" w:type="dxa"/>
-              <w:start w:w="85" w:type="dxa"/>
-              <w:bottom w:w="40" w:type="dxa"/>
-              <w:end w:w="85" w:type="dxa"/>
+              <w:top w:w="80" w:type="dxa"/>
+              <w:start w:w="100" w:type="dxa"/>
+              <w:bottom w:w="80" w:type="dxa"/>
+              <w:end w:w="100" w:type="dxa"/>
             </w:tcMar>
           </w:tcPr>
           <w:p>
@@ -1921,7 +1921,7 @@
             <w:r>
               <w:rPr>
                 <w:rFonts w:ascii="Times New Roman" w:hAnsi="Times New Roman"/>
-                <w:sz w:val="14"/>
+                <w:sz w:val="16"/>
               </w:rPr>
               <w:t>Restart is blocked until acknowledgement</w:t>
             </w:r>
@@ -1931,10 +1931,10 @@
           <w:tcPr>
             <w:tcW w:type="dxa" w:w="1224"/>
             <w:tcMar>
-              <w:top w:w="40" w:type="dxa"/>
-              <w:start w:w="85" w:type="dxa"/>
-              <w:bottom w:w="40" w:type="dxa"/>
-              <w:end w:w="85" w:type="dxa"/>
+              <w:top w:w="80" w:type="dxa"/>
+              <w:start w:w="100" w:type="dxa"/>
+              <w:bottom w:w="80" w:type="dxa"/>
+              <w:end w:w="100" w:type="dxa"/>
             </w:tcMar>
           </w:tcPr>
           <w:p>
@@ -1945,7 +1945,7 @@
             <w:r>
               <w:rPr>
                 <w:rFonts w:ascii="Times New Roman" w:hAnsi="Times New Roman"/>
-                <w:sz w:val="14"/>
+                <w:sz w:val="16"/>
               </w:rPr>
               <w:t>Pass</w:t>
             </w:r>
@@ -1957,10 +1957,10 @@
           <w:tcPr>
             <w:tcW w:type="dxa" w:w="1944"/>
             <w:tcMar>
-              <w:top w:w="40" w:type="dxa"/>
-              <w:start w:w="85" w:type="dxa"/>
-              <w:bottom w:w="40" w:type="dxa"/>
-              <w:end w:w="85" w:type="dxa"/>
+              <w:top w:w="80" w:type="dxa"/>
+              <w:start w:w="100" w:type="dxa"/>
+              <w:bottom w:w="80" w:type="dxa"/>
+              <w:end w:w="100" w:type="dxa"/>
             </w:tcMar>
             <w:shd w:fill="F2F4F7"/>
           </w:tcPr>
@@ -1972,7 +1972,7 @@
             <w:r>
               <w:rPr>
                 <w:rFonts w:ascii="Times New Roman" w:hAnsi="Times New Roman"/>
-                <w:sz w:val="14"/>
+                <w:sz w:val="16"/>
               </w:rPr>
               <w:t>Settings validation</w:t>
             </w:r>
@@ -1982,10 +1982,10 @@
           <w:tcPr>
             <w:tcW w:type="dxa" w:w="5688"/>
             <w:tcMar>
-              <w:top w:w="40" w:type="dxa"/>
-              <w:start w:w="85" w:type="dxa"/>
-              <w:bottom w:w="40" w:type="dxa"/>
-              <w:end w:w="85" w:type="dxa"/>
+              <w:top w:w="80" w:type="dxa"/>
+              <w:start w:w="100" w:type="dxa"/>
+              <w:bottom w:w="80" w:type="dxa"/>
+              <w:end w:w="100" w:type="dxa"/>
             </w:tcMar>
             <w:shd w:fill="F2F4F7"/>
           </w:tcPr>
@@ -1997,9 +1997,9 @@
             <w:r>
               <w:rPr>
                 <w:rFonts w:ascii="Times New Roman" w:hAnsi="Times New Roman"/>
-                <w:sz w:val="14"/>
-              </w:rPr>
-              <w:t>Invalid speed/defect values are rejected</w:t>
+                <w:sz w:val="16"/>
+              </w:rPr>
+              <w:t>Out-of-range speed and defect values are rejected</w:t>
             </w:r>
           </w:p>
         </w:tc>
@@ -2007,10 +2007,10 @@
           <w:tcPr>
             <w:tcW w:type="dxa" w:w="1224"/>
             <w:tcMar>
-              <w:top w:w="40" w:type="dxa"/>
-              <w:start w:w="85" w:type="dxa"/>
-              <w:bottom w:w="40" w:type="dxa"/>
-              <w:end w:w="85" w:type="dxa"/>
+              <w:top w:w="80" w:type="dxa"/>
+              <w:start w:w="100" w:type="dxa"/>
+              <w:bottom w:w="80" w:type="dxa"/>
+              <w:end w:w="100" w:type="dxa"/>
             </w:tcMar>
             <w:shd w:fill="F2F4F7"/>
           </w:tcPr>
@@ -2022,7 +2022,7 @@
             <w:r>
               <w:rPr>
                 <w:rFonts w:ascii="Times New Roman" w:hAnsi="Times New Roman"/>
-                <w:sz w:val="14"/>
+                <w:sz w:val="16"/>
               </w:rPr>
               <w:t>Pass</w:t>
             </w:r>
@@ -2034,10 +2034,10 @@
           <w:tcPr>
             <w:tcW w:type="dxa" w:w="1944"/>
             <w:tcMar>
-              <w:top w:w="40" w:type="dxa"/>
-              <w:start w:w="85" w:type="dxa"/>
-              <w:bottom w:w="40" w:type="dxa"/>
-              <w:end w:w="85" w:type="dxa"/>
+              <w:top w:w="80" w:type="dxa"/>
+              <w:start w:w="100" w:type="dxa"/>
+              <w:bottom w:w="80" w:type="dxa"/>
+              <w:end w:w="100" w:type="dxa"/>
             </w:tcMar>
           </w:tcPr>
           <w:p>
@@ -2048,9 +2048,9 @@
             <w:r>
               <w:rPr>
                 <w:rFonts w:ascii="Times New Roman" w:hAnsi="Times New Roman"/>
-                <w:sz w:val="14"/>
-              </w:rPr>
-              <w:t>Injected fault</w:t>
+                <w:sz w:val="16"/>
+              </w:rPr>
+              <w:t>Injected machine fault</w:t>
             </w:r>
           </w:p>
         </w:tc>
@@ -2058,10 +2058,10 @@
           <w:tcPr>
             <w:tcW w:type="dxa" w:w="5688"/>
             <w:tcMar>
-              <w:top w:w="40" w:type="dxa"/>
-              <w:start w:w="85" w:type="dxa"/>
-              <w:bottom w:w="40" w:type="dxa"/>
-              <w:end w:w="85" w:type="dxa"/>
+              <w:top w:w="80" w:type="dxa"/>
+              <w:start w:w="100" w:type="dxa"/>
+              <w:bottom w:w="80" w:type="dxa"/>
+              <w:end w:w="100" w:type="dxa"/>
             </w:tcMar>
           </w:tcPr>
           <w:p>
@@ -2072,9 +2072,9 @@
             <w:r>
               <w:rPr>
                 <w:rFonts w:ascii="Times New Roman" w:hAnsi="Times New Roman"/>
-                <w:sz w:val="14"/>
-              </w:rPr>
-              <w:t>Line enters FAULT with its message</w:t>
+                <w:sz w:val="16"/>
+              </w:rPr>
+              <w:t>Line enters FAULT state with the specified message</w:t>
             </w:r>
           </w:p>
         </w:tc>
@@ -2082,10 +2082,10 @@
           <w:tcPr>
             <w:tcW w:type="dxa" w:w="1224"/>
             <w:tcMar>
-              <w:top w:w="40" w:type="dxa"/>
-              <w:start w:w="85" w:type="dxa"/>
-              <w:bottom w:w="40" w:type="dxa"/>
-              <w:end w:w="85" w:type="dxa"/>
+              <w:top w:w="80" w:type="dxa"/>
+              <w:start w:w="100" w:type="dxa"/>
+              <w:bottom w:w="80" w:type="dxa"/>
+              <w:end w:w="100" w:type="dxa"/>
             </w:tcMar>
           </w:tcPr>
           <w:p>
@@ -2096,7 +2096,7 @@
             <w:r>
               <w:rPr>
                 <w:rFonts w:ascii="Times New Roman" w:hAnsi="Times New Roman"/>
-                <w:sz w:val="14"/>
+                <w:sz w:val="16"/>
               </w:rPr>
               <w:t>Pass</w:t>
             </w:r>
@@ -2108,10 +2108,10 @@
           <w:tcPr>
             <w:tcW w:type="dxa" w:w="1944"/>
             <w:tcMar>
-              <w:top w:w="40" w:type="dxa"/>
-              <w:start w:w="85" w:type="dxa"/>
-              <w:bottom w:w="40" w:type="dxa"/>
-              <w:end w:w="85" w:type="dxa"/>
+              <w:top w:w="80" w:type="dxa"/>
+              <w:start w:w="100" w:type="dxa"/>
+              <w:bottom w:w="80" w:type="dxa"/>
+              <w:end w:w="100" w:type="dxa"/>
             </w:tcMar>
             <w:shd w:fill="F2F4F7"/>
           </w:tcPr>
@@ -2123,7 +2123,7 @@
             <w:r>
               <w:rPr>
                 <w:rFonts w:ascii="Times New Roman" w:hAnsi="Times New Roman"/>
-                <w:sz w:val="14"/>
+                <w:sz w:val="16"/>
               </w:rPr>
               <w:t>Status API</w:t>
             </w:r>
@@ -2133,10 +2133,10 @@
           <w:tcPr>
             <w:tcW w:type="dxa" w:w="5688"/>
             <w:tcMar>
-              <w:top w:w="40" w:type="dxa"/>
-              <w:start w:w="85" w:type="dxa"/>
-              <w:bottom w:w="40" w:type="dxa"/>
-              <w:end w:w="85" w:type="dxa"/>
+              <w:top w:w="80" w:type="dxa"/>
+              <w:start w:w="100" w:type="dxa"/>
+              <w:bottom w:w="80" w:type="dxa"/>
+              <w:end w:w="100" w:type="dxa"/>
             </w:tcMar>
             <w:shd w:fill="F2F4F7"/>
           </w:tcPr>
@@ -2148,9 +2148,9 @@
             <w:r>
               <w:rPr>
                 <w:rFonts w:ascii="Times New Roman" w:hAnsi="Times New Roman"/>
-                <w:sz w:val="14"/>
-              </w:rPr>
-              <w:t>JSON contains state and temperature</w:t>
+                <w:sz w:val="16"/>
+              </w:rPr>
+              <w:t>JSON response contains state and temperature fields</w:t>
             </w:r>
           </w:p>
         </w:tc>
@@ -2158,10 +2158,10 @@
           <w:tcPr>
             <w:tcW w:type="dxa" w:w="1224"/>
             <w:tcMar>
-              <w:top w:w="40" w:type="dxa"/>
-              <w:start w:w="85" w:type="dxa"/>
-              <w:bottom w:w="40" w:type="dxa"/>
-              <w:end w:w="85" w:type="dxa"/>
+              <w:top w:w="80" w:type="dxa"/>
+              <w:start w:w="100" w:type="dxa"/>
+              <w:bottom w:w="80" w:type="dxa"/>
+              <w:end w:w="100" w:type="dxa"/>
             </w:tcMar>
             <w:shd w:fill="F2F4F7"/>
           </w:tcPr>
@@ -2173,7 +2173,7 @@
             <w:r>
               <w:rPr>
                 <w:rFonts w:ascii="Times New Roman" w:hAnsi="Times New Roman"/>
-                <w:sz w:val="14"/>
+                <w:sz w:val="16"/>
               </w:rPr>
               <w:t>Pass</w:t>
             </w:r>
@@ -2185,10 +2185,10 @@
           <w:tcPr>
             <w:tcW w:type="dxa" w:w="1944"/>
             <w:tcMar>
-              <w:top w:w="40" w:type="dxa"/>
-              <w:start w:w="85" w:type="dxa"/>
-              <w:bottom w:w="40" w:type="dxa"/>
-              <w:end w:w="85" w:type="dxa"/>
+              <w:top w:w="80" w:type="dxa"/>
+              <w:start w:w="100" w:type="dxa"/>
+              <w:bottom w:w="80" w:type="dxa"/>
+              <w:end w:w="100" w:type="dxa"/>
             </w:tcMar>
           </w:tcPr>
           <w:p>
@@ -2199,7 +2199,7 @@
             <w:r>
               <w:rPr>
                 <w:rFonts w:ascii="Times New Roman" w:hAnsi="Times New Roman"/>
-                <w:sz w:val="14"/>
+                <w:sz w:val="16"/>
               </w:rPr>
               <w:t>Start API</w:t>
             </w:r>
@@ -2209,10 +2209,10 @@
           <w:tcPr>
             <w:tcW w:type="dxa" w:w="5688"/>
             <w:tcMar>
-              <w:top w:w="40" w:type="dxa"/>
-              <w:start w:w="85" w:type="dxa"/>
-              <w:bottom w:w="40" w:type="dxa"/>
-              <w:end w:w="85" w:type="dxa"/>
+              <w:top w:w="80" w:type="dxa"/>
+              <w:start w:w="100" w:type="dxa"/>
+              <w:bottom w:w="80" w:type="dxa"/>
+              <w:end w:w="100" w:type="dxa"/>
             </w:tcMar>
           </w:tcPr>
           <w:p>
@@ -2223,7 +2223,7 @@
             <w:r>
               <w:rPr>
                 <w:rFonts w:ascii="Times New Roman" w:hAnsi="Times New Roman"/>
-                <w:sz w:val="14"/>
+                <w:sz w:val="16"/>
               </w:rPr>
               <w:t>POST request starts the production line</w:t>
             </w:r>
@@ -2233,10 +2233,10 @@
           <w:tcPr>
             <w:tcW w:type="dxa" w:w="1224"/>
             <w:tcMar>
-              <w:top w:w="40" w:type="dxa"/>
-              <w:start w:w="85" w:type="dxa"/>
-              <w:bottom w:w="40" w:type="dxa"/>
-              <w:end w:w="85" w:type="dxa"/>
+              <w:top w:w="80" w:type="dxa"/>
+              <w:start w:w="100" w:type="dxa"/>
+              <w:bottom w:w="80" w:type="dxa"/>
+              <w:end w:w="100" w:type="dxa"/>
             </w:tcMar>
           </w:tcPr>
           <w:p>
@@ -2247,7 +2247,7 @@
             <w:r>
               <w:rPr>
                 <w:rFonts w:ascii="Times New Roman" w:hAnsi="Times New Roman"/>
-                <w:sz w:val="14"/>
+                <w:sz w:val="16"/>
               </w:rPr>
               <w:t>Pass</w:t>
             </w:r>
@@ -2259,10 +2259,10 @@
           <w:tcPr>
             <w:tcW w:type="dxa" w:w="1944"/>
             <w:tcMar>
-              <w:top w:w="40" w:type="dxa"/>
-              <w:start w:w="85" w:type="dxa"/>
-              <w:bottom w:w="40" w:type="dxa"/>
-              <w:end w:w="85" w:type="dxa"/>
+              <w:top w:w="80" w:type="dxa"/>
+              <w:start w:w="100" w:type="dxa"/>
+              <w:bottom w:w="80" w:type="dxa"/>
+              <w:end w:w="100" w:type="dxa"/>
             </w:tcMar>
             <w:shd w:fill="F2F4F7"/>
           </w:tcPr>
@@ -2274,7 +2274,7 @@
             <w:r>
               <w:rPr>
                 <w:rFonts w:ascii="Times New Roman" w:hAnsi="Times New Roman"/>
-                <w:sz w:val="14"/>
+                <w:sz w:val="16"/>
               </w:rPr>
               <w:t>Static HMI</w:t>
             </w:r>
@@ -2284,10 +2284,10 @@
           <w:tcPr>
             <w:tcW w:type="dxa" w:w="5688"/>
             <w:tcMar>
-              <w:top w:w="40" w:type="dxa"/>
-              <w:start w:w="85" w:type="dxa"/>
-              <w:bottom w:w="40" w:type="dxa"/>
-              <w:end w:w="85" w:type="dxa"/>
+              <w:top w:w="80" w:type="dxa"/>
+              <w:start w:w="100" w:type="dxa"/>
+              <w:bottom w:w="80" w:type="dxa"/>
+              <w:end w:w="100" w:type="dxa"/>
             </w:tcMar>
             <w:shd w:fill="F2F4F7"/>
           </w:tcPr>
@@ -2299,9 +2299,9 @@
             <w:r>
               <w:rPr>
                 <w:rFonts w:ascii="Times New Roman" w:hAnsi="Times New Roman"/>
-                <w:sz w:val="14"/>
-              </w:rPr>
-              <w:t>Root page serves the interface</w:t>
+                <w:sz w:val="16"/>
+              </w:rPr>
+              <w:t>Root page serves the PencilLine interface</w:t>
             </w:r>
           </w:p>
         </w:tc>
@@ -2309,10 +2309,10 @@
           <w:tcPr>
             <w:tcW w:type="dxa" w:w="1224"/>
             <w:tcMar>
-              <w:top w:w="40" w:type="dxa"/>
-              <w:start w:w="85" w:type="dxa"/>
-              <w:bottom w:w="40" w:type="dxa"/>
-              <w:end w:w="85" w:type="dxa"/>
+              <w:top w:w="80" w:type="dxa"/>
+              <w:start w:w="100" w:type="dxa"/>
+              <w:bottom w:w="80" w:type="dxa"/>
+              <w:end w:w="100" w:type="dxa"/>
             </w:tcMar>
             <w:shd w:fill="F2F4F7"/>
           </w:tcPr>
@@ -2324,7 +2324,7 @@
             <w:r>
               <w:rPr>
                 <w:rFonts w:ascii="Times New Roman" w:hAnsi="Times New Roman"/>
-                <w:sz w:val="14"/>
+                <w:sz w:val="16"/>
               </w:rPr>
               <w:t>Pass</w:t>
             </w:r>
@@ -2346,7 +2346,7 @@
           <w:rFonts w:ascii="Times New Roman" w:hAnsi="Times New Roman"/>
           <w:sz w:val="22"/>
         </w:rPr>
-        <w:t>A demonstration produced accepted and rejected pencils with explicit reasons. The line remained responsive with InfluxDB disabled because telemetry is decoupled from the production thread. With Docker running, the same fields are stored and queried by Grafana.</w:t>
+        <w:t>A representative demonstration run produced good and defective pencils, displayed explicit rejection reasons, and maintained separate machine state and product result values. The production line remained responsive when InfluxDB was disabled because telemetry writes are decoupled from the main state-machine thread. When the Docker stack is running, database health changes to connected and the same fields become available to Grafana.</w:t>
       </w:r>
     </w:p>
     <w:p>
@@ -2376,10 +2376,10 @@
             <w:tcW w:type="dxa" w:w="2952"/>
             <w:shd w:fill="1F2937"/>
             <w:tcMar>
-              <w:top w:w="45" w:type="dxa"/>
-              <w:start w:w="85" w:type="dxa"/>
-              <w:bottom w:w="45" w:type="dxa"/>
-              <w:end w:w="85" w:type="dxa"/>
+              <w:top w:w="80" w:type="dxa"/>
+              <w:start w:w="100" w:type="dxa"/>
+              <w:bottom w:w="80" w:type="dxa"/>
+              <w:end w:w="100" w:type="dxa"/>
             </w:tcMar>
             <w:vAlign w:val="center"/>
           </w:tcPr>
@@ -2392,7 +2392,7 @@
                 <w:rFonts w:ascii="Arial" w:hAnsi="Arial"/>
                 <w:b/>
                 <w:color w:val="FFFFFF"/>
-                <w:sz w:val="15"/>
+                <w:sz w:val="17"/>
               </w:rPr>
               <w:t>File or folder</w:t>
             </w:r>
@@ -2403,10 +2403,10 @@
             <w:tcW w:type="dxa" w:w="5904"/>
             <w:shd w:fill="1F2937"/>
             <w:tcMar>
-              <w:top w:w="45" w:type="dxa"/>
-              <w:start w:w="85" w:type="dxa"/>
-              <w:bottom w:w="45" w:type="dxa"/>
-              <w:end w:w="85" w:type="dxa"/>
+              <w:top w:w="80" w:type="dxa"/>
+              <w:start w:w="100" w:type="dxa"/>
+              <w:bottom w:w="80" w:type="dxa"/>
+              <w:end w:w="100" w:type="dxa"/>
             </w:tcMar>
             <w:vAlign w:val="center"/>
           </w:tcPr>
@@ -2419,7 +2419,7 @@
                 <w:rFonts w:ascii="Arial" w:hAnsi="Arial"/>
                 <w:b/>
                 <w:color w:val="FFFFFF"/>
-                <w:sz w:val="15"/>
+                <w:sz w:val="17"/>
               </w:rPr>
               <w:t>Purpose</w:t>
             </w:r>
@@ -2431,10 +2431,10 @@
           <w:tcPr>
             <w:tcW w:type="dxa" w:w="2952"/>
             <w:tcMar>
-              <w:top w:w="40" w:type="dxa"/>
-              <w:start w:w="85" w:type="dxa"/>
-              <w:bottom w:w="40" w:type="dxa"/>
-              <w:end w:w="85" w:type="dxa"/>
+              <w:top w:w="80" w:type="dxa"/>
+              <w:start w:w="100" w:type="dxa"/>
+              <w:bottom w:w="80" w:type="dxa"/>
+              <w:end w:w="100" w:type="dxa"/>
             </w:tcMar>
           </w:tcPr>
           <w:p>
@@ -2445,7 +2445,7 @@
             <w:r>
               <w:rPr>
                 <w:rFonts w:ascii="Times New Roman" w:hAnsi="Times New Roman"/>
-                <w:sz w:val="15"/>
+                <w:sz w:val="17"/>
               </w:rPr>
               <w:t>app.py</w:t>
             </w:r>
@@ -2455,10 +2455,10 @@
           <w:tcPr>
             <w:tcW w:type="dxa" w:w="5904"/>
             <w:tcMar>
-              <w:top w:w="40" w:type="dxa"/>
-              <w:start w:w="85" w:type="dxa"/>
-              <w:bottom w:w="40" w:type="dxa"/>
-              <w:end w:w="85" w:type="dxa"/>
+              <w:top w:w="80" w:type="dxa"/>
+              <w:start w:w="100" w:type="dxa"/>
+              <w:bottom w:w="80" w:type="dxa"/>
+              <w:end w:w="100" w:type="dxa"/>
             </w:tcMar>
           </w:tcPr>
           <w:p>
@@ -2469,7 +2469,7 @@
             <w:r>
               <w:rPr>
                 <w:rFonts w:ascii="Times New Roman" w:hAnsi="Times New Roman"/>
-                <w:sz w:val="15"/>
+                <w:sz w:val="17"/>
               </w:rPr>
               <w:t>Starts the production model and threaded HTTP server.</w:t>
             </w:r>
@@ -2481,10 +2481,10 @@
           <w:tcPr>
             <w:tcW w:type="dxa" w:w="2952"/>
             <w:tcMar>
-              <w:top w:w="40" w:type="dxa"/>
-              <w:start w:w="85" w:type="dxa"/>
-              <w:bottom w:w="40" w:type="dxa"/>
-              <w:end w:w="85" w:type="dxa"/>
+              <w:top w:w="80" w:type="dxa"/>
+              <w:start w:w="100" w:type="dxa"/>
+              <w:bottom w:w="80" w:type="dxa"/>
+              <w:end w:w="100" w:type="dxa"/>
             </w:tcMar>
             <w:shd w:fill="F2F4F7"/>
           </w:tcPr>
@@ -2496,7 +2496,7 @@
             <w:r>
               <w:rPr>
                 <w:rFonts w:ascii="Times New Roman" w:hAnsi="Times New Roman"/>
-                <w:sz w:val="15"/>
+                <w:sz w:val="17"/>
               </w:rPr>
               <w:t>production_line/engine.py</w:t>
             </w:r>
@@ -2506,10 +2506,10 @@
           <w:tcPr>
             <w:tcW w:type="dxa" w:w="5904"/>
             <w:tcMar>
-              <w:top w:w="40" w:type="dxa"/>
-              <w:start w:w="85" w:type="dxa"/>
-              <w:bottom w:w="40" w:type="dxa"/>
-              <w:end w:w="85" w:type="dxa"/>
+              <w:top w:w="80" w:type="dxa"/>
+              <w:start w:w="100" w:type="dxa"/>
+              <w:bottom w:w="80" w:type="dxa"/>
+              <w:end w:w="100" w:type="dxa"/>
             </w:tcMar>
             <w:shd w:fill="F2F4F7"/>
           </w:tcPr>
@@ -2521,7 +2521,7 @@
             <w:r>
               <w:rPr>
                 <w:rFonts w:ascii="Times New Roman" w:hAnsi="Times New Roman"/>
-                <w:sz w:val="15"/>
+                <w:sz w:val="17"/>
               </w:rPr>
               <w:t>State machine, stages, defects, faults, counters, and telemetry.</w:t>
             </w:r>
@@ -2533,10 +2533,10 @@
           <w:tcPr>
             <w:tcW w:type="dxa" w:w="2952"/>
             <w:tcMar>
-              <w:top w:w="40" w:type="dxa"/>
-              <w:start w:w="85" w:type="dxa"/>
-              <w:bottom w:w="40" w:type="dxa"/>
-              <w:end w:w="85" w:type="dxa"/>
+              <w:top w:w="80" w:type="dxa"/>
+              <w:start w:w="100" w:type="dxa"/>
+              <w:bottom w:w="80" w:type="dxa"/>
+              <w:end w:w="100" w:type="dxa"/>
             </w:tcMar>
           </w:tcPr>
           <w:p>
@@ -2547,9 +2547,9 @@
             <w:r>
               <w:rPr>
                 <w:rFonts w:ascii="Times New Roman" w:hAnsi="Times New Roman"/>
-                <w:sz w:val="15"/>
-              </w:rPr>
-              <w:t>influx_writer.py</w:t>
+                <w:sz w:val="17"/>
+              </w:rPr>
+              <w:t>production_line/influx_writer.py</w:t>
             </w:r>
           </w:p>
         </w:tc>
@@ -2557,10 +2557,10 @@
           <w:tcPr>
             <w:tcW w:type="dxa" w:w="5904"/>
             <w:tcMar>
-              <w:top w:w="40" w:type="dxa"/>
-              <w:start w:w="85" w:type="dxa"/>
-              <w:bottom w:w="40" w:type="dxa"/>
-              <w:end w:w="85" w:type="dxa"/>
+              <w:top w:w="80" w:type="dxa"/>
+              <w:start w:w="100" w:type="dxa"/>
+              <w:bottom w:w="80" w:type="dxa"/>
+              <w:end w:w="100" w:type="dxa"/>
             </w:tcMar>
           </w:tcPr>
           <w:p>
@@ -2571,9 +2571,9 @@
             <w:r>
               <w:rPr>
                 <w:rFonts w:ascii="Times New Roman" w:hAnsi="Times New Roman"/>
-                <w:sz w:val="15"/>
-              </w:rPr>
-              <w:t>Background health checks and line-protocol writes.</w:t>
+                <w:sz w:val="17"/>
+              </w:rPr>
+              <w:t>Background InfluxDB health checks and line-protocol writes.</w:t>
             </w:r>
           </w:p>
         </w:tc>
@@ -2583,10 +2583,10 @@
           <w:tcPr>
             <w:tcW w:type="dxa" w:w="2952"/>
             <w:tcMar>
-              <w:top w:w="40" w:type="dxa"/>
-              <w:start w:w="85" w:type="dxa"/>
-              <w:bottom w:w="40" w:type="dxa"/>
-              <w:end w:w="85" w:type="dxa"/>
+              <w:top w:w="80" w:type="dxa"/>
+              <w:start w:w="100" w:type="dxa"/>
+              <w:bottom w:w="80" w:type="dxa"/>
+              <w:end w:w="100" w:type="dxa"/>
             </w:tcMar>
             <w:shd w:fill="F2F4F7"/>
           </w:tcPr>
@@ -2598,7 +2598,7 @@
             <w:r>
               <w:rPr>
                 <w:rFonts w:ascii="Times New Roman" w:hAnsi="Times New Roman"/>
-                <w:sz w:val="15"/>
+                <w:sz w:val="17"/>
               </w:rPr>
               <w:t>static/</w:t>
             </w:r>
@@ -2608,10 +2608,10 @@
           <w:tcPr>
             <w:tcW w:type="dxa" w:w="5904"/>
             <w:tcMar>
-              <w:top w:w="40" w:type="dxa"/>
-              <w:start w:w="85" w:type="dxa"/>
-              <w:bottom w:w="40" w:type="dxa"/>
-              <w:end w:w="85" w:type="dxa"/>
+              <w:top w:w="80" w:type="dxa"/>
+              <w:start w:w="100" w:type="dxa"/>
+              <w:bottom w:w="80" w:type="dxa"/>
+              <w:end w:w="100" w:type="dxa"/>
             </w:tcMar>
             <w:shd w:fill="F2F4F7"/>
           </w:tcPr>
@@ -2623,9 +2623,9 @@
             <w:r>
               <w:rPr>
                 <w:rFonts w:ascii="Times New Roman" w:hAnsi="Times New Roman"/>
-                <w:sz w:val="15"/>
-              </w:rPr>
-              <w:t>Browser HMI and API client.</w:t>
+                <w:sz w:val="17"/>
+              </w:rPr>
+              <w:t>Browser HMI and JavaScript API client.</w:t>
             </w:r>
           </w:p>
         </w:tc>
@@ -2635,10 +2635,10 @@
           <w:tcPr>
             <w:tcW w:type="dxa" w:w="2952"/>
             <w:tcMar>
-              <w:top w:w="40" w:type="dxa"/>
-              <w:start w:w="85" w:type="dxa"/>
-              <w:bottom w:w="40" w:type="dxa"/>
-              <w:end w:w="85" w:type="dxa"/>
+              <w:top w:w="80" w:type="dxa"/>
+              <w:start w:w="100" w:type="dxa"/>
+              <w:bottom w:w="80" w:type="dxa"/>
+              <w:end w:w="100" w:type="dxa"/>
             </w:tcMar>
           </w:tcPr>
           <w:p>
@@ -2649,7 +2649,7 @@
             <w:r>
               <w:rPr>
                 <w:rFonts w:ascii="Times New Roman" w:hAnsi="Times New Roman"/>
-                <w:sz w:val="15"/>
+                <w:sz w:val="17"/>
               </w:rPr>
               <w:t>grafana/</w:t>
             </w:r>
@@ -2659,10 +2659,10 @@
           <w:tcPr>
             <w:tcW w:type="dxa" w:w="5904"/>
             <w:tcMar>
-              <w:top w:w="40" w:type="dxa"/>
-              <w:start w:w="85" w:type="dxa"/>
-              <w:bottom w:w="40" w:type="dxa"/>
-              <w:end w:w="85" w:type="dxa"/>
+              <w:top w:w="80" w:type="dxa"/>
+              <w:start w:w="100" w:type="dxa"/>
+              <w:bottom w:w="80" w:type="dxa"/>
+              <w:end w:w="100" w:type="dxa"/>
             </w:tcMar>
           </w:tcPr>
           <w:p>
@@ -2673,7 +2673,7 @@
             <w:r>
               <w:rPr>
                 <w:rFonts w:ascii="Times New Roman" w:hAnsi="Times New Roman"/>
-                <w:sz w:val="15"/>
+                <w:sz w:val="17"/>
               </w:rPr>
               <w:t>Provisioned data source and dashboard.</w:t>
             </w:r>
@@ -2685,10 +2685,10 @@
           <w:tcPr>
             <w:tcW w:type="dxa" w:w="2952"/>
             <w:tcMar>
-              <w:top w:w="40" w:type="dxa"/>
-              <w:start w:w="85" w:type="dxa"/>
-              <w:bottom w:w="40" w:type="dxa"/>
-              <w:end w:w="85" w:type="dxa"/>
+              <w:top w:w="80" w:type="dxa"/>
+              <w:start w:w="100" w:type="dxa"/>
+              <w:bottom w:w="80" w:type="dxa"/>
+              <w:end w:w="100" w:type="dxa"/>
             </w:tcMar>
             <w:shd w:fill="F2F4F7"/>
           </w:tcPr>
@@ -2700,9 +2700,9 @@
             <w:r>
               <w:rPr>
                 <w:rFonts w:ascii="Times New Roman" w:hAnsi="Times New Roman"/>
-                <w:sz w:val="15"/>
-              </w:rPr>
-              <w:t>tests/ and Compose</w:t>
+                <w:sz w:val="17"/>
+              </w:rPr>
+              <w:t>tests/</w:t>
             </w:r>
           </w:p>
         </w:tc>
@@ -2710,10 +2710,10 @@
           <w:tcPr>
             <w:tcW w:type="dxa" w:w="5904"/>
             <w:tcMar>
-              <w:top w:w="40" w:type="dxa"/>
-              <w:start w:w="85" w:type="dxa"/>
-              <w:bottom w:w="40" w:type="dxa"/>
-              <w:end w:w="85" w:type="dxa"/>
+              <w:top w:w="80" w:type="dxa"/>
+              <w:start w:w="100" w:type="dxa"/>
+              <w:bottom w:w="80" w:type="dxa"/>
+              <w:end w:w="100" w:type="dxa"/>
             </w:tcMar>
             <w:shd w:fill="F2F4F7"/>
           </w:tcPr>
@@ -2725,9 +2725,59 @@
             <w:r>
               <w:rPr>
                 <w:rFonts w:ascii="Times New Roman" w:hAnsi="Times New Roman"/>
-                <w:sz w:val="15"/>
-              </w:rPr>
-              <w:t>Automated tests and three-service deployment.</w:t>
+                <w:sz w:val="17"/>
+              </w:rPr>
+              <w:t>Unit and API tests.</w:t>
+            </w:r>
+          </w:p>
+        </w:tc>
+      </w:tr>
+      <w:tr>
+        <w:tc>
+          <w:tcPr>
+            <w:tcW w:type="dxa" w:w="2952"/>
+            <w:tcMar>
+              <w:top w:w="80" w:type="dxa"/>
+              <w:start w:w="100" w:type="dxa"/>
+              <w:bottom w:w="80" w:type="dxa"/>
+              <w:end w:w="100" w:type="dxa"/>
+            </w:tcMar>
+          </w:tcPr>
+          <w:p>
+            <w:pPr>
+              <w:spacing w:line="252" w:lineRule="auto"/>
+              <w:jc w:val="center"/>
+            </w:pPr>
+            <w:r>
+              <w:rPr>
+                <w:rFonts w:ascii="Times New Roman" w:hAnsi="Times New Roman"/>
+                <w:sz w:val="17"/>
+              </w:rPr>
+              <w:t>docker-compose.yml</w:t>
+            </w:r>
+          </w:p>
+        </w:tc>
+        <w:tc>
+          <w:tcPr>
+            <w:tcW w:type="dxa" w:w="5904"/>
+            <w:tcMar>
+              <w:top w:w="80" w:type="dxa"/>
+              <w:start w:w="100" w:type="dxa"/>
+              <w:bottom w:w="80" w:type="dxa"/>
+              <w:end w:w="100" w:type="dxa"/>
+            </w:tcMar>
+          </w:tcPr>
+          <w:p>
+            <w:pPr>
+              <w:spacing w:line="252" w:lineRule="auto"/>
+              <w:jc w:val="left"/>
+            </w:pPr>
+            <w:r>
+              <w:rPr>
+                <w:rFonts w:ascii="Times New Roman" w:hAnsi="Times New Roman"/>
+                <w:sz w:val="17"/>
+              </w:rPr>
+              <w:t>Defines the three-service deployment and persistent volumes.</w:t>
             </w:r>
           </w:p>
         </w:tc>
@@ -2872,7 +2922,7 @@
             <w:rFonts w:ascii="Times New Roman" w:hAnsi="Times New Roman"/>
             <w:sz w:val="22"/>
           </w:rPr>
-          <w:t>https://mohannadahmednabil.github.io/100007801_Aly_AP/</w:t>
+          <w:t>https://mohannad275.github.io/100007801_Aly_AP/</w:t>
         </w:r>
       </w:hyperlink>
     </w:p>
@@ -2895,7 +2945,7 @@
             <w:rFonts w:ascii="Times New Roman" w:hAnsi="Times New Roman"/>
             <w:sz w:val="22"/>
           </w:rPr>
-          <w:t>https://github.com/mohannadahmednabil/100007801_Aly_AP</w:t>
+          <w:t>https://github.com/mohannad275/100007801_Aly_AP</w:t>
         </w:r>
       </w:hyperlink>
     </w:p>
@@ -3038,7 +3088,7 @@
           <w:rFonts w:ascii="Times New Roman" w:hAnsi="Times New Roman"/>
           <w:sz w:val="22"/>
         </w:rPr>
-        <w:t>The project meets the functional scope: more than four manufacturing stages, Python backend logic, explicit defect reasons, required HMI controls, InfluxDB telemetry, and a Grafana dashboard. Its strongest feature is separation of concerns: assembly, machine state, controls, database communication, visualization, deployment, testing, and publishing are organized in clear modules.</w:t>
+        <w:t>The project meets the requested functional scope: it simulates a manufacturing line with more than four stages, provides Python backend logic, identifies defective products and their reasons, implements the required HMI controls, writes production data to InfluxDB, and provisions a Grafana dashboard. The strongest aspect is the separation of concerns. Product assembly, machine state, operator controls, database communication, visualization, deployment, testing, and website publishing are contained in clear files and can be understood independently.</w:t>
       </w:r>
     </w:p>
     <w:p>
@@ -3050,7 +3100,7 @@
           <w:rFonts w:ascii="Times New Roman" w:hAnsi="Times New Roman"/>
           <w:sz w:val="22"/>
         </w:rPr>
-        <w:t>The HMI demonstrates the live sequence, adjustable parameters, accepted and rejected products, and fault recovery. A background database writer prevents telemetry problems from freezing production, while automated tests verify essential commands and endpoints.</w:t>
+        <w:t>The HMI also gives a convincing demonstration of production behavior. Operators can observe the live sequence, control the line, alter simulation parameters, see accepted and rejected products, and deliberately test fault recovery. The background database writer means that a database problem does not freeze the process. Automated tests provide evidence that essential commands and API endpoints behave as intended.</w:t>
       </w:r>
     </w:p>
     <w:p>
@@ -3062,7 +3112,7 @@
           <w:rFonts w:ascii="Times New Roman" w:hAnsi="Times New Roman"/>
           <w:sz w:val="22"/>
         </w:rPr>
-        <w:t>The main weakness is that this is a simulation, not a real-time controller. It has no deterministic timing, PLC interface, physical safety circuit, or certified emergency stop; measurements and faults are statistical. The lightweight HTTP server is not suitable for public production use. A deployed system would require a hardened server, encryption, authentication, authorization, network segmentation, secure secrets, audit retention, backups, and maintenance procedures.</w:t>
+        <w:t>The implementation has important weaknesses. It is a simulation rather than a real-time controller and therefore has no deterministic timing guarantee, programmable-logic-controller interface, physical safety circuit, or certified emergency-stop function. Sensor values and faults are generated statistically rather than received from hardware. The standard-library HTTP server is deliberately lightweight and is not recommended as a public production server; a deployed version would require a hardened application server, encrypted connections, user authentication, role-based authorization, network segmentation, secure secret handling, audit retention, backups, and maintenance procedures.</w:t>
       </w:r>
     </w:p>
     <w:p>
@@ -3074,7 +3124,7 @@
           <w:rFonts w:ascii="Times New Roman" w:hAnsi="Times New Roman"/>
           <w:sz w:val="22"/>
         </w:rPr>
-        <w:t>Further development could connect OPC UA or a PLC, and add recipes, maintenance work orders, alarm history, OEE, retention policies, Grafana alerts, and predictive maintenance. Real OT systems must prioritize safety, availability, integrity, and controlled change; NIST emphasizes their unique reliability, performance, and safety requirements (Stouffer et al., 2023). The application is therefore an educational prototype, not a controller for physical machinery.</w:t>
+        <w:t>Further development could connect the software to an OPC UA server or PLC, add recipe management, maintenance work orders, alarm acknowledgement history, Overall Equipment Effectiveness calculations, database retention policies, Grafana alerts, and predictive-maintenance models. A real operational-technology solution must prioritize safety, availability, integrity, and controlled change. NIST guidance emphasizes that OT security must account for unique reliability, performance, and safety requirements (Stouffer et al., 2023). For this reason, the current application should be treated as an educational prototype and a basis for further engineering, not as a controller for physical machinery.</w:t>
       </w:r>
     </w:p>
     <w:tbl>

</xml_diff>